<commit_message>
docs: update public URLs to seruliana/cluvr and regenerate PHTBB-5.docx
</commit_message>
<xml_diff>
--- a/PHTBB-5.docx
+++ b/PHTBB-5.docx
@@ -120,15 +120,15 @@
               </w:rPr>
               <w:t>Төслийн хүрээ: Corg.ly Pet Onboarding API (UE-5 Лабораторийн жишиг) &amp; Cluvr платформ (Хөтөч төсөл)</w:t>
               <w:br/>
-              <w:t>Хувилбар: v1.0 (Sprint 05) | Огноо: 2026-10-05 | GitHub: https://github.com/saruul3339/ICSI438-pd</w:t>
+              <w:t>Хувилбар: v1.0 (Sprint 05) | Огноо: 2026-10-05 | GitHub: https://github.com/seruliana/cluvr</w:t>
               <w:br/>
               <w:t>Нээлттэй Public URL-ууд (GitHub Pages):</w:t>
               <w:br/>
-              <w:t xml:space="preserve">  • Redoc Reader View: https://saruul3339.github.io/ICSI438-pd/</w:t>
+              <w:t xml:space="preserve">  • Redoc Reader View: https://seruliana.github.io/cluvr/</w:t>
               <w:br/>
-              <w:t xml:space="preserve">  • Swagger UI Sandbox: https://saruul3339.github.io/ICSI438-pd/swagger.html</w:t>
+              <w:t xml:space="preserve">  • Swagger UI Sandbox: https://seruliana.github.io/cluvr/swagger.html</w:t>
               <w:br/>
-              <w:t xml:space="preserve">  • OpenAPI 3.0 YAML: https://saruul3339.github.io/ICSI438-pd/openapi.yaml</w:t>
+              <w:t xml:space="preserve">  • OpenAPI 3.0 YAML: https://seruliana.github.io/cluvr/openapi.yaml</w:t>
               <w:br/>
               <w:t>Definition of Done: OpenAPI 3.0.3 Validated (0 errors) ✔ | 6 Endpoints Defined ✔ | Bhatti 5 Principles Scorecard (4.80/5.00 = 96%) ✔ | Prism Mock Tested ✔ | GitHub Pages Live ✔ | CI Pipeline (Bonus +10%) ✔ | 100-Word Decision Report ✔</w:t>
             </w:r>
@@ -588,9 +588,9 @@
               </w:rPr>
               <w:t>GitHub Pages дээр бүрэн deploy хийгдсэн:</w:t>
               <w:br/>
-              <w:t>• Redoc: https://saruul3339.github.io/ICSI438-pd/</w:t>
+              <w:t>• Redoc: https://seruliana.github.io/cluvr/</w:t>
               <w:br/>
-              <w:t>• Swagger UI: https://saruul3339.github.io/ICSI438-pd/swagger.html</w:t>
+              <w:t>• Swagger UI: https://seruliana.github.io/cluvr/swagger.html</w:t>
             </w:r>
           </w:p>
         </w:tc>
@@ -4922,7 +4922,7 @@
                 <w:color w:val="1F2937"/>
                 <w:sz w:val="19"/>
               </w:rPr>
-              <w:t>https://saruul3339.github.io/ICSI438-pd/swagger.html</w:t>
+              <w:t>https://seruliana.github.io/cluvr/swagger.html</w:t>
             </w:r>
           </w:p>
         </w:tc>
@@ -4948,7 +4948,7 @@
                 <w:color w:val="1F2937"/>
                 <w:sz w:val="19"/>
               </w:rPr>
-              <w:t>https://saruul3339.github.io/ICSI438-pd/</w:t>
+              <w:t>https://seruliana.github.io/cluvr/</w:t>
             </w:r>
           </w:p>
         </w:tc>
@@ -5359,7 +5359,7 @@
           <w:color w:val="1F2937"/>
           <w:sz w:val="22"/>
         </w:rPr>
-        <w:t>Sprint 05-ийн хүрээнд хийгдсэн бүх код, спецификаци, баримтууд төслийн дараах бүтцэд хадгалагдсан бөгөөд GitHub репозиторт (https://github.com/saruul3339/ICSI438-pd) байршиж байна:</w:t>
+        <w:t>Sprint 05-ийн хүрээнд хийгдсэн бүх код, спецификаци, баримтууд төслийн дараах бүтцэд хадгалагдсан бөгөөд GitHub репозиторт (https://github.com/seruliana/cluvr) байршиж байна:</w:t>
       </w:r>
     </w:p>
     <w:p>

</xml_diff>